<commit_message>
Taggeo: los sdt de bloque se sustituyen por párrafo, no por run
'Word experienced an error trying to open the file' en los CUATRO
rellenados: el control 'No. EXPEDIENTE' de los encabezados es un sdt de
NIVEL BLOQUE (contiene párrafos) y sustituirlo por un run pelado deja un
run como hijo directo de un contenedor de bloques — XML bien formado que
Word no puede abrir. Ahora sustituir_sdt detecta el nivel: bloque → párrafo
(conservando el pPr original, la alineación del cuadro), inline → run.

Verificación nueva en el chequeo: ningún run como hijo directo de
body/txbxContent/tc, ningún placeholder residual, xmlns cubiertos. Y los
cuatro rellenados pasan por un lector independiente (textutil de macOS)
extrayendo el texto completo con los datos adentro.

Co-Authored-By: Claude Opus 4.8 (1M context) <noreply@anthropic.com>
</commit_message>
<xml_diff>
--- a/plantillas/dgcp/SNCC_F033_Of_Economica-tpl.docx
+++ b/plantillas/dgcp/SNCC_F033_Of_Economica-tpl.docx
@@ -144,9 +144,14 @@
               <v:shape id="_x0000_s1048" type="#_x0000_t202" style="position:absolute;left:9151;top:1077;width:2009;height:543;mso-width-relative:margin;mso-height-relative:margin" fillcolor="white [3212]" strokecolor="white [3212]" strokeweight="2.25pt">
                 <v:textbox style="mso-next-textbox:#_x0000_s1048" inset=",0">
                   <w:txbxContent>
-                    <w:r>
-                      <w:t xml:space="preserve">{expediente}</w:t>
-                    </w:r>
+                    <w:p>
+                      <w:pPr>
+                        <w:jc w:val="center"/>
+                      </w:pPr>
+                      <w:r>
+                        <w:t xml:space="preserve">{expediente}</w:t>
+                      </w:r>
+                    </w:p>
                   </w:txbxContent>
                 </v:textbox>
               </v:shape>

</xml_diff>

<commit_message>
Taggeo: sin rojo heredado y sin textos guía en los membretes
Los datos rellenados heredaban el color ROJO de las instrucciones
originales del formulario ('es solo para indicarte que ahí van los
datos'): la pasada limpiar_formato_de_tags quita color, cursiva y
resaltado de todo run que contenga un marcador — el dato entra en negro
con la fuente del formulario. Y los textos guía de los membretes ('Nombre
del Capítulo y/o dependencia gubernamental', 'Nombre del Departamento ó
Unidad Funcional…'), que vivían en los encabezados y sus cajas duplicadas,
ahora se taggean globalmente ({entidad_nombre}, {unidad_funcional}) en
todas las partes del documento. Verificado: cero runs coloreados sobre los
datos y cero textos guía residuales en los cuatro rellenados.

Co-Authored-By: Claude Opus 4.8 (1M context) <noreply@anthropic.com>
</commit_message>
<xml_diff>
--- a/plantillas/dgcp/SNCC_F033_Of_Economica-tpl.docx
+++ b/plantillas/dgcp/SNCC_F033_Of_Economica-tpl.docx
@@ -6,7 +6,6 @@
       <w:r>
         <w:rPr>
           <w:rStyle w:val="Institucion"/>
-          <w:color w:val="FF0000"/>
           <w:sz w:val="28"/>
           <w:lang w:eastAsia="zh-TW"/>
         </w:rPr>
@@ -48,7 +47,7 @@
                           <w:sz w:val="24"/>
                           <w:szCs w:val="24"/>
                         </w:rPr>
-                        <w:t>Nombre de</w:t>
+                        <w:t xml:space="preserve">{entidad_nombre}</w:t>
                       </w:r>
                       <w:r>
                         <w:rPr>
@@ -56,7 +55,7 @@
                           <w:sz w:val="24"/>
                           <w:szCs w:val="24"/>
                         </w:rPr>
-                        <w:t>l Capitulo y/o</w:t>
+                        <w:t xml:space="preserve"/>
                       </w:r>
                       <w:r>
                         <w:rPr>
@@ -64,7 +63,7 @@
                           <w:sz w:val="24"/>
                           <w:szCs w:val="24"/>
                         </w:rPr>
-                        <w:t xml:space="preserve"> dependencia gubernamental</w:t>
+                        <w:t xml:space="preserve"/>
                       </w:r>
                     </w:sdtContent>
                   </w:sdt>
@@ -1122,7 +1121,6 @@
       <w:r>
         <w:rPr>
           <w:rFonts w:ascii="Arial" w:hAnsi="Arial" w:cs="Arial"/>
-          <w:color w:val="FF0000"/>
           <w:sz w:val="20"/>
           <w:szCs w:val="22"/>
         </w:rPr>
@@ -1171,7 +1169,6 @@
       </w:pPr>
       <w:r>
         <w:rPr>
-          <w:color w:val="000000"/>
           <w:sz w:val="20"/>
           <w:szCs w:val="20"/>
         </w:rPr>

</xml_diff>

<commit_message>
Logo institucional en TODOS los formularios, F.042 firmado y «Generar este»
- Los 4 SNCC restantes (F.033/034/042/047) taggean su recuadro «Logo de
  la dependencia gubernamental» con {%logo_institucion} — igual que el
  F.040. Sin logo cargado salen idénticos a antes.
- El F.042 oficial no trae zona de firma: bloque {%firma} {%sello} al
  pie (por eso salía sin sellar).
- ?solo=<código> en /generar: baja UN formulario directo (docx o pdf),
  sin gate ni ZIP; lo archiva y marca listo en segundo plano. En la Bid
  Room el chip «Se genera aquí» ahora es el botón «Generar este».
- Huella motor v5 (cambió cómo se imprimen los documentos).

Co-Authored-By: Claude Fable 5 <noreply@anthropic.com>
Claude-Session: https://claude.ai/code/session_01SY6Gin5TsCAiwckSx1BpwX
</commit_message>
<xml_diff>
--- a/plantillas/dgcp/SNCC_F033_Of_Economica-tpl.docx
+++ b/plantillas/dgcp/SNCC_F033_Of_Economica-tpl.docx
@@ -250,79 +250,14 @@
           <v:shape id="_x0000_s1026" type="#_x0000_t202" style="position:absolute;margin-left:-28.65pt;margin-top:-25.75pt;width:83.1pt;height:79.7pt;z-index:251661312;mso-position-horizontal-relative:text;mso-position-vertical-relative:text;mso-width-relative:margin;mso-height-relative:margin" filled="f" stroked="f">
             <v:textbox style="mso-next-textbox:#_x0000_s1026">
               <w:txbxContent>
-                <w:sdt>
-                  <w:sdtPr>
-                    <w:rPr>
-                      <w:lang w:val="en-US"/>
-                    </w:rPr>
-                    <w:alias w:val="Logo de la dependencia gubernamental"/>
-                    <w:tag w:val="Logo de la dependencia gubernamental"/>
-                    <w:id w:val="13417745"/>
-                    <w:showingPlcHdr/>
-                    <w:picture/>
-                  </w:sdtPr>
-                  <w:sdtEndPr/>
-                  <w:sdtContent>
-                    <w:p>
-                      <w:pPr>
-                        <w:rPr>
-                          <w:lang w:val="en-US"/>
-                        </w:rPr>
-                      </w:pPr>
-                      <w:r>
-                        <w:rPr>
-                          <w:noProof/>
-                          <w:lang w:val="es-DO" w:eastAsia="es-DO"/>
-                        </w:rPr>
-                        <w:drawing>
-                          <wp:inline distT="0" distB="0" distL="0" distR="0">
-                            <wp:extent cx="800100" cy="800100"/>
-                            <wp:effectExtent l="19050" t="0" r="0" b="0"/>
-                            <wp:docPr id="2" name="Picture 1"/>
-                            <wp:cNvGraphicFramePr>
-                              <a:graphicFrameLocks noChangeAspect="1"/>
-                            </wp:cNvGraphicFramePr>
-                            <a:graphic>
-                              <a:graphicData uri="http://schemas.openxmlformats.org/drawingml/2006/picture">
-                                <pic:pic>
-                                  <pic:nvPicPr>
-                                    <pic:cNvPr id="0" name="Picture 1"/>
-                                    <pic:cNvPicPr>
-                                      <a:picLocks noChangeAspect="1" noChangeArrowheads="1"/>
-                                    </pic:cNvPicPr>
-                                  </pic:nvPicPr>
-                                  <pic:blipFill>
-                                    <a:blip r:embed="rId8"/>
-                                    <a:srcRect/>
-                                    <a:stretch>
-                                      <a:fillRect/>
-                                    </a:stretch>
-                                  </pic:blipFill>
-                                  <pic:spPr bwMode="auto">
-                                    <a:xfrm>
-                                      <a:off x="0" y="0"/>
-                                      <a:ext cx="799693" cy="799693"/>
-                                    </a:xfrm>
-                                    <a:prstGeom prst="rect">
-                                      <a:avLst/>
-                                    </a:prstGeom>
-                                    <a:noFill/>
-                                    <a:ln w="9525">
-                                      <a:noFill/>
-                                      <a:miter lim="800000"/>
-                                      <a:headEnd/>
-                                      <a:tailEnd/>
-                                    </a:ln>
-                                  </pic:spPr>
-                                </pic:pic>
-                              </a:graphicData>
-                            </a:graphic>
-                          </wp:inline>
-                        </w:drawing>
-                      </w:r>
-                    </w:p>
-                  </w:sdtContent>
-                </w:sdt>
+                <w:p>
+                  <w:pPr>
+                    <w:jc w:val="center"/>
+                  </w:pPr>
+                  <w:r>
+                    <w:t xml:space="preserve">{%logo_institucion}</w:t>
+                  </w:r>
+                </w:p>
               </w:txbxContent>
             </v:textbox>
           </v:shape>

</xml_diff>

<commit_message>
F.034/F.042: el nombre de la institución salía cortado
Los formularios oficiales llevan los datos de cabecera en cuadros de
texto flotantes de tamaño fijo con noAutofit: un nombre de institución
más largo que el cuadro (8,7 cm) se recortaba en silencio al rellenar.
Ahora todo cuadro que contenga un marcador auto-ajusta su alto
(spAutoFit / mso-fit-shape-to-text) y el texto largo hace el cuadro
crecer en vez de perderse. F.033 y F.047 tenían lo mismo en su copia
VML; los rótulos fijos del formato no se tocan.

El paso quedó en taggear-plantillas.py pero se aplicó a las -tpl
committeadas sin regenerar: e8635c2 editó los .docx sin portar el
cambio al tagger y regenerar pierde el logo institucional y la firma
del F.042 (advertencia añadida al script). No es un bug de Cloudflare:
pasa igual en Vercel — falta llevar este fix a licitaciones-fase-3.

Co-Authored-By: Claude Fable 5 <noreply@anthropic.com>
</commit_message>
<xml_diff>
--- a/plantillas/dgcp/SNCC_F033_Of_Economica-tpl.docx
+++ b/plantillas/dgcp/SNCC_F033_Of_Economica-tpl.docx
@@ -15,7 +15,7 @@
             <v:path gradientshapeok="t" o:connecttype="rect"/>
           </v:shapetype>
           <v:shape id="_x0000_s1040" type="#_x0000_t202" style="position:absolute;margin-left:208.45pt;margin-top:9.1pt;width:260.75pt;height:22pt;z-index:251691008;mso-width-relative:margin;mso-height-relative:margin" stroked="f">
-            <v:textbox style="mso-next-textbox:#_x0000_s1040">
+            <v:textbox style="mso-next-textbox:#_x0000_s1040;mso-fit-shape-to-text:t">
               <w:txbxContent>
                 <w:p>
                   <w:pPr>
@@ -141,7 +141,7 @@
             <v:rect id="_x0000_s1046" style="position:absolute;left:12866;top:523;width:2544;height:1104" filled="f"/>
             <v:group id="_x0000_s1047" style="position:absolute;left:12940;top:561;width:2413;height:968" coordorigin="9151,720" coordsize="2009,900">
               <v:shape id="_x0000_s1048" type="#_x0000_t202" style="position:absolute;left:9151;top:1077;width:2009;height:543;mso-width-relative:margin;mso-height-relative:margin" fillcolor="white [3212]" strokecolor="white [3212]" strokeweight="2.25pt">
-                <v:textbox style="mso-next-textbox:#_x0000_s1048" inset=",0">
+                <v:textbox style="mso-next-textbox:#_x0000_s1048;mso-fit-shape-to-text:t" inset=",0">
                   <w:txbxContent>
                     <w:p>
                       <w:pPr>
@@ -248,7 +248,7 @@
         </w:rPr>
         <w:pict>
           <v:shape id="_x0000_s1026" type="#_x0000_t202" style="position:absolute;margin-left:-28.65pt;margin-top:-25.75pt;width:83.1pt;height:79.7pt;z-index:251661312;mso-position-horizontal-relative:text;mso-position-vertical-relative:text;mso-width-relative:margin;mso-height-relative:margin" filled="f" stroked="f">
-            <v:textbox style="mso-next-textbox:#_x0000_s1026">
+            <v:textbox style="mso-next-textbox:#_x0000_s1026;mso-fit-shape-to-text:t">
               <w:txbxContent>
                 <w:p>
                   <w:pPr>
@@ -338,7 +338,7 @@
         </w:rPr>
         <w:pict>
           <v:shape id="_x0000_s1036" type="#_x0000_t202" style="position:absolute;margin-left:598.75pt;margin-top:2.75pt;width:119.75pt;height:21.9pt;z-index:251685888;mso-width-relative:margin;mso-height-relative:margin" filled="f" stroked="f">
-            <v:textbox style="mso-next-textbox:#_x0000_s1036">
+            <v:textbox style="mso-next-textbox:#_x0000_s1036;mso-fit-shape-to-text:t">
               <w:txbxContent>
                 <w:p>
                   <w:r>

</xml_diff>

<commit_message>
El nombre de la institución seguía cortado: eran los sdt y una fuente fantasma
El primer arreglo (spAutoFit) no bastaba: LibreOffice/Gotenberg maquetea
fatal un control de contenido (sdt) dentro de un cuadro de texto y hasta
«Ministerio de Hacienda» perdía palabras. Fecha y expediente nunca se
cortaron porque el tagger ya les quitaba el sdt; al nombre de la
institución se lo dejaba puesto. Además Style6 declara la fuente
«Arial Bold», que no existe como familia: Word la resuelve, LibreOffice
la sustituye por una serif con otras métricas.

Dos pasos nuevos en taggear-plantillas.py, aplicados también a las -tpl
committeadas: desenvolver_sdt_con_tags() (el sdt queda reducido a sus
runs) y arreglar_fuente_fantasma() («Arial Bold» → «Arial»; la negrita
ya viene en w:b). Verificado con renders PNG vía Gotenberg: F.034 y
F.042 muestran el nombre completo en dos líneas limpias.

Co-Authored-By: Claude Fable 5 <noreply@anthropic.com>
</commit_message>
<xml_diff>
--- a/plantillas/dgcp/SNCC_F033_Of_Economica-tpl.docx
+++ b/plantillas/dgcp/SNCC_F033_Of_Economica-tpl.docx
@@ -24,49 +24,14 @@
                       <w:lang w:val="es-ES_tradnl"/>
                     </w:rPr>
                   </w:pPr>
-                  <w:sdt>
-                    <w:sdtPr>
-                      <w:rPr>
-                        <w:rStyle w:val="Style6"/>
-                        <w:sz w:val="24"/>
-                        <w:szCs w:val="24"/>
-                      </w:rPr>
-                      <w:alias w:val="Nombre de la Institución"/>
-                      <w:tag w:val="Nombre de la Institución"/>
-                      <w:id w:val="8389551"/>
-                    </w:sdtPr>
-                    <w:sdtEndPr>
-                      <w:rPr>
-                        <w:rStyle w:val="Style6"/>
-                      </w:rPr>
-                    </w:sdtEndPr>
-                    <w:sdtContent>
-                      <w:r>
-                        <w:rPr>
-                          <w:rStyle w:val="Style6"/>
-                          <w:sz w:val="24"/>
-                          <w:szCs w:val="24"/>
-                        </w:rPr>
-                        <w:t xml:space="preserve">{entidad_nombre}</w:t>
-                      </w:r>
-                      <w:r>
-                        <w:rPr>
-                          <w:rStyle w:val="Style6"/>
-                          <w:sz w:val="24"/>
-                          <w:szCs w:val="24"/>
-                        </w:rPr>
-                        <w:t xml:space="preserve"/>
-                      </w:r>
-                      <w:r>
-                        <w:rPr>
-                          <w:rStyle w:val="Style6"/>
-                          <w:sz w:val="24"/>
-                          <w:szCs w:val="24"/>
-                        </w:rPr>
-                        <w:t xml:space="preserve"/>
-                      </w:r>
-                    </w:sdtContent>
-                  </w:sdt>
+                  <w:r>
+                    <w:rPr>
+                      <w:rStyle w:val="Style6"/>
+                      <w:sz w:val="24"/>
+                      <w:szCs w:val="24"/>
+                    </w:rPr>
+                    <w:t xml:space="preserve">{entidad_nombre}</w:t>
+                  </w:r>
                 </w:p>
               </w:txbxContent>
             </v:textbox>
@@ -1982,7 +1947,7 @@
     <w:uiPriority w:val="1"/>
     <w:rsid w:val="00CE67A3"/>
     <w:rPr>
-      <w:rFonts w:ascii="Arial Bold" w:hAnsi="Arial Bold"/>
+      <w:rFonts w:ascii="Arial" w:hAnsi="Arial"/>
       <w:b/>
       <w:shadow/>
       <w:sz w:val="22"/>
@@ -1994,7 +1959,7 @@
     <w:uiPriority w:val="1"/>
     <w:rsid w:val="00535962"/>
     <w:rPr>
-      <w:rFonts w:ascii="Arial Bold" w:hAnsi="Arial Bold"/>
+      <w:rFonts w:ascii="Arial" w:hAnsi="Arial"/>
       <w:b/>
       <w:caps/>
       <w:shadow/>
@@ -2008,7 +1973,7 @@
     <w:uiPriority w:val="1"/>
     <w:rsid w:val="00194FF2"/>
     <w:rPr>
-      <w:rFonts w:ascii="Arial Bold" w:hAnsi="Arial Bold"/>
+      <w:rFonts w:ascii="Arial" w:hAnsi="Arial"/>
       <w:b/>
       <w:caps/>
       <w:shadow/>
@@ -2057,7 +2022,7 @@
     <w:uiPriority w:val="1"/>
     <w:rsid w:val="00C66D08"/>
     <w:rPr>
-      <w:rFonts w:ascii="Arial Bold" w:hAnsi="Arial Bold"/>
+      <w:rFonts w:ascii="Arial" w:hAnsi="Arial"/>
       <w:b/>
       <w:caps/>
       <w:sz w:val="24"/>
@@ -2070,7 +2035,7 @@
     <w:qFormat/>
     <w:rsid w:val="00C66D08"/>
     <w:rPr>
-      <w:rFonts w:ascii="Arial Bold" w:hAnsi="Arial Bold"/>
+      <w:rFonts w:ascii="Arial" w:hAnsi="Arial"/>
       <w:b/>
       <w:spacing w:val="-20"/>
       <w:w w:val="90"/>
@@ -2083,7 +2048,7 @@
     <w:uiPriority w:val="1"/>
     <w:rsid w:val="00C66D08"/>
     <w:rPr>
-      <w:rFonts w:ascii="Arial Bold" w:hAnsi="Arial Bold"/>
+      <w:rFonts w:ascii="Arial" w:hAnsi="Arial"/>
       <w:b/>
       <w:caps/>
       <w:spacing w:val="-2"/>

</xml_diff>